<commit_message>
WIP snapshot 2026-04-18: nav.js rollout across pages + exec summary updates
Preserving working-tree state before security hardening pass.
Includes new shared nav.js, Company-Analysis-VTV.pdf, updated
exec summary builder, and nav integration across 54 HTML pages.

Co-Authored-By: Claude Opus 4.7 (1M context) <noreply@anthropic.com>
</commit_message>
<xml_diff>
--- a/VTV-Executive-Summary.docx
+++ b/VTV-Executive-Summary.docx
@@ -726,6 +726,16 @@
         <w:rPr>
           <w:sz w:val="20"/>
         </w:rPr>
+        <w:t>Independent Company Analysis: 80% Investment Match • 8.4/10 Business Model Grade</w:t>
+        <w:br/>
+        <w:t>Third-party evaluation across 10 standardized investment parameters. 7 of 10 rated Excellent. Scored 10/10 on Exit Potential and Attractiveness for Future Capital Raises. 9/10 on Scalability, Market Size, and Revenue Model.</w:t>
+      </w:r>
+    </w:p>
+    <w:p>
+      <w:r>
+        <w:rPr>
+          <w:sz w:val="20"/>
+        </w:rPr>
         <w:t>External Proof Points:</w:t>
         <w:br/>
         <w:t>• 4–5 external companies launching with VTV assessment integration</w:t>
@@ -753,6 +763,20 @@
         <w:t>• LTV:CAC Ratio: 6:1+</w:t>
         <w:br/>
         <w:t>• Infrastructure: $8–10K/mo at scale</w:t>
+      </w:r>
+    </w:p>
+    <w:p>
+      <w:r>
+        <w:rPr>
+          <w:sz w:val="20"/>
+        </w:rPr>
+        <w:t>Known Risks (from Independent Analysis) &amp; How We Address Them:</w:t>
+        <w:br/>
+        <w:t>• CAC Strategy (7/10): Free assessment funnel converts at zero paid CAC. Target blended CAC: $35–$60. FitCarna cross-referral creates organic pipeline.</w:t>
+        <w:br/>
+        <w:t>• Traction Breadth (7/10): Current traction is fitness-concentrated by design — FitCarna is the Phase 1 revenue engine. Dating vertical launches Month 1 post-funding.</w:t>
+        <w:br/>
+        <w:t>• Team Depth (7/10): $540K (31%) of raised capital goes to engineering hires. Founder built entire platform solo — proving technical capability. Senior SaaS hire is #1 priority post-close.</w:t>
       </w:r>
     </w:p>
     <w:p/>

</xml_diff>